<commit_message>
Develop purpose TEEL paragraphs around clear ideas and matched evidence
Replace repeated purpose formulas with eight coherent models. Use names and identity for the shared deck and worksheet model, keeping the existing TEEL structure and colour scheme. Generate the worksheet from the same paragraph source and keep it on two pages.

Retain saved classroom writing while refreshing unchanged suggestions from previous versions. Preserve the imagination and power resources and the recent folio changes.

Verified projector fit, suggestion controls, brainstorm choices, saved-state migration, matching worksheet text and both printed pages. Quotation fragments match existing unit text; no student details added.
</commit_message>
<xml_diff>
--- a/BoneSparrow-TEEL-purpose.docx
+++ b/BoneSparrow-TEEL-purpose.docx
@@ -205,8 +205,8 @@
               <w:rPr>
                 <w:b/>
                 <w:bCs/>
-                <w:color w:val="0B447C"/>
-                <w:shd w:val="clear" w:color="auto" w:fill="D6EAFC"/>
+                <w:color w:val="1F5C33"/>
+                <w:shd w:val="clear" w:color="auto" w:fill="DFF0E2"/>
               </w:rPr>
               <w:t xml:space="preserve">makes the reader see</w:t>
             </w:r>
@@ -217,8 +217,8 @@
               <w:rPr>
                 <w:b/>
                 <w:bCs/>
-                <w:color w:val="0B447C"/>
-                <w:shd w:val="clear" w:color="auto" w:fill="D6EAFC"/>
+                <w:color w:val="1F5C33"/>
+                <w:shd w:val="clear" w:color="auto" w:fill="DFF0E2"/>
               </w:rPr>
               <w:t xml:space="preserve">people behind the numbers</w:t>
             </w:r>
@@ -1104,43 +1104,43 @@
           </w:tcPr>
           <w:p>
             <w:pPr>
-              <w:spacing w:after="140" w:line="520" w:lineRule="exact"/>
+              <w:spacing w:after="140" w:line="360" w:lineRule="exact"/>
             </w:pPr>
             <w:r>
               <w:rPr>
                 <w:sz w:val="23"/>
                 <w:szCs w:val="23"/>
               </w:rPr>
-              <w:t xml:space="preserve">One way Fraillon makes the reader see the people behind the numbers is by having one adult learn their names.</w:t>
+              <w:t xml:space="preserve">Fraillon shows that names and language are important parts of a person's identity.</w:t>
             </w:r>
           </w:p>
           <w:p>
             <w:pPr>
-              <w:spacing w:after="140" w:line="520" w:lineRule="exact"/>
+              <w:spacing w:after="140" w:line="360" w:lineRule="exact"/>
             </w:pPr>
             <w:r>
               <w:rPr>
                 <w:sz w:val="23"/>
                 <w:szCs w:val="23"/>
               </w:rPr>
-              <w:t xml:space="preserve">When Subhi describes Harvey, “…learn their names so that he can talk with us for real, instead of talking to us by our numbers.” This shows that using a name is a choice the camp never requires, which shows the reader exactly what a number takes away.</w:t>
+              <w:t xml:space="preserve">Harvey learns the children's names so that he can “talk with us for real, instead of talking to us by our numbers”. The contrast suggests that using a name recognises the individual, drawing attention to the impersonal way the camp treats its detainees.</w:t>
             </w:r>
           </w:p>
           <w:p>
             <w:pPr>
-              <w:spacing w:after="140" w:line="520" w:lineRule="exact"/>
+              <w:spacing w:after="140" w:line="360" w:lineRule="exact"/>
             </w:pPr>
             <w:r>
               <w:rPr>
                 <w:sz w:val="23"/>
                 <w:szCs w:val="23"/>
               </w:rPr>
-              <w:t xml:space="preserve">After Nasir dies, “…I whisper the few words of Rohingya that I know, just so my brain doesn’t turn to thinking that they are right and that I am only Aussie Boy.” This shows that Subhi holds on to his language to hold on to himself, which makes the reader feel the effort of staying a person.</w:t>
+              <w:t xml:space="preserve">Subhi whispers “the few words of Rohingya that I know” to remind himself that he is more than “only Aussie Boy”. His determination emphasises his need to preserve his culture and encourages readers to respect this part of his identity.</w:t>
             </w:r>
           </w:p>
           <w:p>
             <w:pPr>
-              <w:spacing w:line="520" w:lineRule="exact"/>
+              <w:spacing w:line="360" w:lineRule="exact"/>
             </w:pPr>
             <w:proofErr w:type="gramStart"/>
             <w:r>
@@ -1148,7 +1148,7 @@
                 <w:sz w:val="23"/>
                 <w:szCs w:val="23"/>
               </w:rPr>
-              <w:t xml:space="preserve">So</w:t>
+              <w:t xml:space="preserve">By showing the importance of a name and a connection to culture, Fraillon invites readers to respect the individual identities hidden by the camp's numbers.</w:t>
             </w:r>
             <w:proofErr w:type="gramEnd"/>
             <w:r>
@@ -1156,7 +1156,7 @@
                 <w:sz w:val="23"/>
                 <w:szCs w:val="23"/>
               </w:rPr>
-              <w:t xml:space="preserve"> using a name is a choice the camp never requires and Subhi holds on to his language to hold on to himself, which is how having one adult learn their names makes the reader see the people behind the numbers.</w:t>
+              <w:t xml:space="preserve"/>
             </w:r>
           </w:p>
         </w:tc>
@@ -1175,7 +1175,7 @@
           <w:szCs w:val="24"/>
         </w:rPr>
         <w:lastRenderedPageBreak/>
-        <w:t xml:space="preserve">Another way</w:t>
+        <w:t xml:space="preserve">Another idea</w:t>
       </w:r>
     </w:p>
     <w:p>
@@ -1183,7 +1183,7 @@
         <w:spacing w:after="120"/>
       </w:pPr>
       <w:r>
-        <w:t xml:space="preserve">My way: ____________________________.  Two things it shows:</w:t>
+        <w:t xml:space="preserve">My idea: ____________________________.  Two points to develop:</w:t>
       </w:r>
     </w:p>
     <w:p>
@@ -1361,7 +1361,7 @@
                 <w:sz w:val="17"/>
                 <w:szCs w:val="17"/>
               </w:rPr>
-              <w:t xml:space="preserve">One way Fraillon makes the reader see the people behind the numbers is by …</w:t>
+              <w:t xml:space="preserve">Fraillon shows that …</w:t>
             </w:r>
           </w:p>
         </w:tc>
@@ -2105,7 +2105,7 @@
                 <w:sz w:val="17"/>
                 <w:szCs w:val="17"/>
               </w:rPr>
-              <w:t xml:space="preserve">So A and B, which is how … makes the reader see the people behind the numbers.</w:t>
+              <w:t xml:space="preserve">Through …, Fraillon encourages readers to …</w:t>
             </w:r>
           </w:p>
         </w:tc>

</xml_diff>